<commit_message>
在 TAS2O_Curriculum_Mapping_Expectations_Coverage_AI_Enhanced.docx 里新增了： Specific Expectations Coverage (Paraphrased Alignment) 一个三列表格，按 A1.1-A1.4、A2、A3、A4、B1、B2、B3 分组写明了覆盖焦点和证据来源 在 TAS2O_Unit_Plans_AI_Enhanced.docx 里给 6 个单元的 curriculum alignment 加了具体 expectation 重点句 把 unit plan 前言里误插入的文字恢复干净了，没有破坏总述结构
</commit_message>
<xml_diff>
--- a/01_Course_Core/TAS2O_Curriculum_Mapping_Expectations_Coverage_AI_Enhanced.docx
+++ b/01_Course_Core/TAS2O_Curriculum_Mapping_Expectations_Coverage_AI_Enhanced.docx
@@ -3782,6 +3782,288 @@
         <w:t>Ontario Ministry of Education. Private Schools Policy and Procedures Manual: https://files.ontario.ca/edu-private-schools-policy-procedures-manual-2013-en-2021-11-25.pdf</w:t>
       </w:r>
     </w:p>
+    <w:p>
+      <w:r>
+        <w:t>8. Specific Expectations Coverage (Paraphrased Alignment)</w:t>
+      </w:r>
+    </w:p>
+    <w:p>
+      <w:r>
+        <w:t>This appendix is a paraphrased internal coverage map aligned to the official TAS2O 2024 expectations and is intended for planning and inspection readiness. It organizes the specific expectations by strand group so the school can show where each expectation is taught, practised, assessed, and evidenced.</w:t>
+      </w:r>
+    </w:p>
+    <w:tbl>
+      <w:tblPr>
+        <w:tblW w:type="auto" w:w="0"/>
+        <w:tblLook w:firstColumn="1" w:firstRow="1" w:lastColumn="0" w:lastRow="0" w:noHBand="0" w:noVBand="1" w:val="04A0"/>
+      </w:tblPr>
+      <w:tblGrid>
+        <w:gridCol w:w="4752"/>
+        <w:gridCol w:w="4752"/>
+        <w:gridCol w:w="4752"/>
+      </w:tblGrid>
+      <w:tr>
+        <w:tc>
+          <w:tcPr>
+            <w:tcW w:type="dxa" w:w="4752"/>
+          </w:tcPr>
+          <w:p>
+            <w:r>
+              <w:t>Specific Expectation Group</w:t>
+            </w:r>
+          </w:p>
+        </w:tc>
+        <w:tc>
+          <w:tcPr>
+            <w:tcW w:type="dxa" w:w="4752"/>
+          </w:tcPr>
+          <w:p>
+            <w:r>
+              <w:t>Paraphrased Coverage Focus</w:t>
+            </w:r>
+          </w:p>
+        </w:tc>
+        <w:tc>
+          <w:tcPr>
+            <w:tcW w:type="dxa" w:w="4752"/>
+          </w:tcPr>
+          <w:p>
+            <w:r>
+              <w:t>Primary Evidence in This Package</w:t>
+            </w:r>
+          </w:p>
+        </w:tc>
+      </w:tr>
+      <w:tr>
+        <w:tc>
+          <w:tcPr>
+            <w:tcW w:type="dxa" w:w="4752"/>
+          </w:tcPr>
+          <w:p>
+            <w:r>
+              <w:t>A1.1-A1.4</w:t>
+            </w:r>
+          </w:p>
+        </w:tc>
+        <w:tc>
+          <w:tcPr>
+            <w:tcW w:type="dxa" w:w="4752"/>
+          </w:tcPr>
+          <w:p>
+            <w:r>
+              <w:t>Apply fundamental technological concepts, evaluate significance, consider design and accessibility requirements, and communicate design ideas using appropriate terminology and formats.</w:t>
+            </w:r>
+          </w:p>
+        </w:tc>
+        <w:tc>
+          <w:tcPr>
+            <w:tcW w:type="dxa" w:w="4752"/>
+          </w:tcPr>
+          <w:p>
+            <w:r>
+              <w:t>Design brief, concept sketches, CAD files, oral explanation, safety mini challenge</w:t>
+            </w:r>
+          </w:p>
+        </w:tc>
+      </w:tr>
+      <w:tr>
+        <w:tc>
+          <w:tcPr>
+            <w:tcW w:type="dxa" w:w="4752"/>
+          </w:tcPr>
+          <w:p>
+            <w:r>
+              <w:t>A2 cluster</w:t>
+            </w:r>
+          </w:p>
+        </w:tc>
+        <w:tc>
+          <w:tcPr>
+            <w:tcW w:type="dxa" w:w="4752"/>
+          </w:tcPr>
+          <w:p>
+            <w:r>
+              <w:t>Create products, services, or prototypes using tools, resources, and techniques; record project development and practical decision-making.</w:t>
+            </w:r>
+          </w:p>
+        </w:tc>
+        <w:tc>
+          <w:tcPr>
+            <w:tcW w:type="dxa" w:w="4752"/>
+          </w:tcPr>
+          <w:p>
+            <w:r>
+              <w:t>Prototype build logs, fabrication notes, CAD output, photos, demo evidence</w:t>
+            </w:r>
+          </w:p>
+        </w:tc>
+      </w:tr>
+      <w:tr>
+        <w:tc>
+          <w:tcPr>
+            <w:tcW w:type="dxa" w:w="4752"/>
+          </w:tcPr>
+          <w:p>
+            <w:r>
+              <w:t>A3 cluster</w:t>
+            </w:r>
+          </w:p>
+        </w:tc>
+        <w:tc>
+          <w:tcPr>
+            <w:tcW w:type="dxa" w:w="4752"/>
+          </w:tcPr>
+          <w:p>
+            <w:r>
+              <w:t>Evaluate, test, troubleshoot, and refine processes, products, or services using evidence and feedback.</w:t>
+            </w:r>
+          </w:p>
+        </w:tc>
+        <w:tc>
+          <w:tcPr>
+            <w:tcW w:type="dxa" w:w="4752"/>
+          </w:tcPr>
+          <w:p>
+            <w:r>
+              <w:t>Testing notes, QC report, debugging log, revision history, reflections</w:t>
+            </w:r>
+          </w:p>
+        </w:tc>
+      </w:tr>
+      <w:tr>
+        <w:tc>
+          <w:tcPr>
+            <w:tcW w:type="dxa" w:w="4752"/>
+          </w:tcPr>
+          <w:p>
+            <w:r>
+              <w:t>A4 cluster</w:t>
+            </w:r>
+          </w:p>
+        </w:tc>
+        <w:tc>
+          <w:tcPr>
+            <w:tcW w:type="dxa" w:w="4752"/>
+          </w:tcPr>
+          <w:p>
+            <w:r>
+              <w:t>Apply health and safety practices and procedures consistently when using materials, tools, equipment, and workspaces.</w:t>
+            </w:r>
+          </w:p>
+        </w:tc>
+        <w:tc>
+          <w:tcPr>
+            <w:tcW w:type="dxa" w:w="4752"/>
+          </w:tcPr>
+          <w:p>
+            <w:r>
+              <w:t>Safety Passport, PPE checklist, observation records, incident procedures</w:t>
+            </w:r>
+          </w:p>
+        </w:tc>
+      </w:tr>
+      <w:tr>
+        <w:tc>
+          <w:tcPr>
+            <w:tcW w:type="dxa" w:w="4752"/>
+          </w:tcPr>
+          <w:p>
+            <w:r>
+              <w:t>B1 cluster</w:t>
+            </w:r>
+          </w:p>
+        </w:tc>
+        <w:tc>
+          <w:tcPr>
+            <w:tcW w:type="dxa" w:w="4752"/>
+          </w:tcPr>
+          <w:p>
+            <w:r>
+              <w:t>Explain how needs and social, economic, and environmental factors drive technological development and the way solutions are designed.</w:t>
+            </w:r>
+          </w:p>
+        </w:tc>
+        <w:tc>
+          <w:tcPr>
+            <w:tcW w:type="dxa" w:w="4752"/>
+          </w:tcPr>
+          <w:p>
+            <w:r>
+              <w:t>Materials comparison, technology development reflection, planning notes</w:t>
+            </w:r>
+          </w:p>
+        </w:tc>
+      </w:tr>
+      <w:tr>
+        <w:tc>
+          <w:tcPr>
+            <w:tcW w:type="dxa" w:w="4752"/>
+          </w:tcPr>
+          <w:p>
+            <w:r>
+              <w:t>B2 cluster</w:t>
+            </w:r>
+          </w:p>
+        </w:tc>
+        <w:tc>
+          <w:tcPr>
+            <w:tcW w:type="dxa" w:w="4752"/>
+          </w:tcPr>
+          <w:p>
+            <w:r>
+              <w:t>Analyze the impacts of technologies on individuals, communities, society, the economy, accessibility, ethics, and the environment.</w:t>
+            </w:r>
+          </w:p>
+        </w:tc>
+        <w:tc>
+          <w:tcPr>
+            <w:tcW w:type="dxa" w:w="4752"/>
+          </w:tcPr>
+          <w:p>
+            <w:r>
+              <w:t>Sustainability case study, impact analysis, AI ethics reflection</w:t>
+            </w:r>
+          </w:p>
+        </w:tc>
+      </w:tr>
+      <w:tr>
+        <w:tc>
+          <w:tcPr>
+            <w:tcW w:type="dxa" w:w="4752"/>
+          </w:tcPr>
+          <w:p>
+            <w:r>
+              <w:t>B3 cluster</w:t>
+            </w:r>
+          </w:p>
+        </w:tc>
+        <w:tc>
+          <w:tcPr>
+            <w:tcW w:type="dxa" w:w="4752"/>
+          </w:tcPr>
+          <w:p>
+            <w:r>
+              <w:t>Investigate careers and pathways in technology and skilled trades, including apprenticeships, credentials, workplace expectations, and next-step planning.</w:t>
+            </w:r>
+          </w:p>
+        </w:tc>
+        <w:tc>
+          <w:tcPr>
+            <w:tcW w:type="dxa" w:w="4752"/>
+          </w:tcPr>
+          <w:p>
+            <w:r>
+              <w:t>Career pathway report, interview simulation reflection, presentation</w:t>
+            </w:r>
+          </w:p>
+        </w:tc>
+      </w:tr>
+    </w:tbl>
+    <w:p>
+      <w:r>
+        <w:t>Coverage note: This package does not rely on AI outputs as sole evidence. The school uses student explanation, teacher observation, practical work, and documented verification to confirm achievement of the expectations above.</w:t>
+      </w:r>
+    </w:p>
     <w:sectPr>
       <w:headerReference w:type="default" r:id="rId9"/>
       <w:footerReference w:type="default" r:id="rId10"/>

</xml_diff>